<commit_message>
Math T5 : intégrer la structure validée au manuel complet
Co-authored-by: arena-agent <297053741+arena-agent@users.noreply.github.com>
</commit_message>
<xml_diff>
--- a/manuel-math-t5/Manuel_Mathematiques_T5_UNITE1.docx
+++ b/manuel-math-t5/Manuel_Mathematiques_T5_UNITE1.docx
@@ -1337,25 +1337,6 @@
     </w:p>
     <w:p>
       <w:pPr>
-        <w:spacing w:after="80" w:before="120"/>
-        <w:jc w:val="center"/>
-      </w:pPr>
-      <w:r>
-        <w:rPr>
-          <w:rFonts w:ascii="Times New Roman" w:cs="Times New Roman" w:eastAsia="Times New Roman" w:hAnsi="Times New Roman"/>
-          <w:b/>
-          <w:bCs/>
-          <w:i w:val="false"/>
-          <w:iCs w:val="false"/>
-          <w:color w:val="E7E6E6"/>
-          <w:sz w:val="22"/>
-          <w:szCs w:val="22"/>
-        </w:rPr>
-        <w:t xml:space="preserve">MATHÉMATIQUES — T5</w:t>
-      </w:r>
-    </w:p>
-    <w:p>
-      <w:pPr>
         <w:spacing w:after="150" w:before="200"/>
         <w:jc w:val="center"/>
       </w:pPr>
@@ -1391,7 +1372,7 @@
           <w:sz w:val="28"/>
           <w:szCs w:val="28"/>
         </w:rPr>
-        <w:t xml:space="preserve">Nombres naturels jusqu’à 1 000 000</w:t>
+        <w:t xml:space="preserve">1. Les nombres jusqu’à 1 000 000</w:t>
       </w:r>
     </w:p>
     <w:p>
@@ -1480,7 +1461,26 @@
     </w:p>
     <w:p>
       <w:pPr>
-        <w:spacing w:after="130" w:before="100" w:line="300"/>
+        <w:spacing w:after="150" w:before="200"/>
+        <w:jc w:val="left"/>
+      </w:pPr>
+      <w:r>
+        <w:rPr>
+          <w:rFonts w:ascii="Times New Roman" w:cs="Times New Roman" w:eastAsia="Times New Roman" w:hAnsi="Times New Roman"/>
+          <w:b/>
+          <w:bCs/>
+          <w:i w:val="false"/>
+          <w:iCs w:val="false"/>
+          <w:color w:val="2E7D32"/>
+          <w:sz w:val="28"/>
+          <w:szCs w:val="28"/>
+        </w:rPr>
+        <w:t xml:space="preserve">2. Lecture</w:t>
+      </w:r>
+    </w:p>
+    <w:p>
+      <w:pPr>
+        <w:spacing w:after="110" w:line="300"/>
         <w:jc w:val="both"/>
       </w:pPr>
       <w:r>
@@ -1488,14 +1488,71 @@
           <w:rFonts w:ascii="Times New Roman" w:cs="Times New Roman" w:eastAsia="Times New Roman" w:hAnsi="Times New Roman"/>
           <w:b w:val="false"/>
           <w:bCs w:val="false"/>
-          <w:i/>
-          <w:iCs/>
-          <w:color w:val="000000"/>
-          <w:sz w:val="24"/>
-          <w:szCs w:val="24"/>
-          <w:u w:val="single"/>
-        </w:rPr>
-        <w:t xml:space="preserve">602 040 se lit « six cent deux mille quarante » ; « quinze mille neuf » s’écrit 15 009.</w:t>
+          <w:i w:val="false"/>
+          <w:iCs w:val="false"/>
+          <w:color w:val="000000"/>
+          <w:sz w:val="24"/>
+          <w:szCs w:val="24"/>
+        </w:rPr>
+        <w:t xml:space="preserve">On lit de gauche à droite : la première classe, puis le mot « million » ou « mille », puis la classe suivante. Les zéros qui indiquent une classe vide ne se prononcent pas.</w:t>
+      </w:r>
+    </w:p>
+    <w:p>
+      <w:pPr>
+        <w:shd w:fill="EAF2F8" w:val="clear"/>
+        <w:spacing w:after="110" w:line="300"/>
+        <w:jc w:val="both"/>
+      </w:pPr>
+      <w:r>
+        <w:rPr>
+          <w:rFonts w:ascii="Times New Roman" w:cs="Times New Roman" w:eastAsia="Times New Roman" w:hAnsi="Times New Roman"/>
+          <w:b w:val="false"/>
+          <w:bCs w:val="false"/>
+          <w:i w:val="false"/>
+          <w:iCs w:val="false"/>
+          <w:color w:val="000000"/>
+          <w:sz w:val="24"/>
+          <w:szCs w:val="24"/>
+        </w:rPr>
+        <w:t xml:space="preserve">Les mots-nombres utiles : zéro, un, deux, trois, quatre, cinq, six, sept, huit, neuf, dix, onze, douze, treize, quatorze, quinze, seize ; vingt, trente, quarante, cinquante, soixante ; soixante-dix, quatre-vingts, quatre-vingt-dix ; cent, mille et million.</w:t>
+      </w:r>
+    </w:p>
+    <w:p>
+      <w:pPr>
+        <w:spacing w:after="150" w:before="200"/>
+        <w:jc w:val="left"/>
+      </w:pPr>
+      <w:r>
+        <w:rPr>
+          <w:rFonts w:ascii="Times New Roman" w:cs="Times New Roman" w:eastAsia="Times New Roman" w:hAnsi="Times New Roman"/>
+          <w:b/>
+          <w:bCs/>
+          <w:i w:val="false"/>
+          <w:iCs w:val="false"/>
+          <w:color w:val="2E7D32"/>
+          <w:sz w:val="28"/>
+          <w:szCs w:val="28"/>
+        </w:rPr>
+        <w:t xml:space="preserve">3. Écriture</w:t>
+      </w:r>
+    </w:p>
+    <w:p>
+      <w:pPr>
+        <w:spacing w:after="110" w:line="300"/>
+        <w:jc w:val="both"/>
+      </w:pPr>
+      <w:r>
+        <w:rPr>
+          <w:rFonts w:ascii="Times New Roman" w:cs="Times New Roman" w:eastAsia="Times New Roman" w:hAnsi="Times New Roman"/>
+          <w:b w:val="false"/>
+          <w:bCs w:val="false"/>
+          <w:i w:val="false"/>
+          <w:iCs w:val="false"/>
+          <w:color w:val="000000"/>
+          <w:sz w:val="24"/>
+          <w:szCs w:val="24"/>
+        </w:rPr>
+        <w:t xml:space="preserve">Pour écrire un nombre entendu, je cherche d’abord les mots million et mille. Je remplis ensuite le tableau de droite à gauche, un chiffre par case, et je complète les classes avec les zéros nécessaires.</w:t>
       </w:r>
     </w:p>
     <w:p>
@@ -1515,7 +1572,7 @@
           <w:sz w:val="24"/>
           <w:szCs w:val="24"/>
         </w:rPr>
-        <w:t xml:space="preserve">1. Réviser d’abord les mots-nombres des dizaines, surtout soixante-dix, quatre-vingts, quatre-vingt-dix.</w:t>
+        <w:t xml:space="preserve">1. 70 = soixante-dix ; 80 = quatre-vingts ; 90 = quatre-vingt-dix.</w:t>
       </w:r>
     </w:p>
     <w:p>
@@ -1535,7 +1592,7 @@
           <w:sz w:val="24"/>
           <w:szCs w:val="24"/>
         </w:rPr>
-        <w:t xml:space="preserve">2. Séparer le nombre en classes de trois chiffres en partant de la droite.</w:t>
+        <w:t xml:space="preserve">2. Je sépare le nombre en classes de trois chiffres en partant de la droite : 2 | 343 | 216.</w:t>
       </w:r>
     </w:p>
     <w:p>
@@ -1555,7 +1612,7 @@
           <w:sz w:val="24"/>
           <w:szCs w:val="24"/>
         </w:rPr>
-        <w:t xml:space="preserve">3. Lire avec le cache : une classe à la fois, de gauche à droite, en disant « mille », « millions », « milliards » entre les classes.</w:t>
+        <w:t xml:space="preserve">3. Je lis les classes de gauche à droite : deux millions, trois cent quarante-trois mille, deux cent seize.</w:t>
       </w:r>
     </w:p>
     <w:p>
@@ -1575,7 +1632,40 @@
           <w:sz w:val="24"/>
           <w:szCs w:val="24"/>
         </w:rPr>
-        <w:t xml:space="preserve">4. Pour écrire un nombre dicté, remplir le tableau de droite à gauche et compléter chaque classe avec des zéros si besoin.</w:t>
+        <w:t xml:space="preserve">4. Pour écrire un nombre entendu, je place les chiffres de droite à gauche et je complète les classes avec des zéros : 203 070.</w:t>
+      </w:r>
+    </w:p>
+    <w:p>
+      <w:pPr>
+        <w:spacing w:after="130" w:before="100" w:line="300"/>
+        <w:jc w:val="both"/>
+      </w:pPr>
+      <w:r>
+        <w:rPr>
+          <w:rFonts w:ascii="Times New Roman" w:cs="Times New Roman" w:eastAsia="Times New Roman" w:hAnsi="Times New Roman"/>
+          <w:b w:val="false"/>
+          <w:bCs w:val="false"/>
+          <w:i/>
+          <w:iCs/>
+          <w:color w:val="000000"/>
+          <w:sz w:val="24"/>
+          <w:szCs w:val="24"/>
+          <w:u w:val="single"/>
+        </w:rPr>
+        <w:t xml:space="preserve">Exemple :</w:t>
+      </w:r>
+      <w:r>
+        <w:rPr>
+          <w:rFonts w:ascii="Times New Roman" w:cs="Times New Roman" w:eastAsia="Times New Roman" w:hAnsi="Times New Roman"/>
+          <w:b w:val="false"/>
+          <w:bCs w:val="false"/>
+          <w:i w:val="false"/>
+          <w:iCs w:val="false"/>
+          <w:color w:val="000000"/>
+          <w:sz w:val="24"/>
+          <w:szCs w:val="24"/>
+        </w:rPr>
+        <w:t xml:space="preserve"> 602 040 se lit « six cent deux mille quarante » ; « quinze mille neuf » s’écrit 15 009.</w:t>
       </w:r>
     </w:p>
     <w:p>
@@ -2048,25 +2138,6 @@
     <w:p>
       <w:r>
         <w:br w:type="page"/>
-      </w:r>
-    </w:p>
-    <w:p>
-      <w:pPr>
-        <w:spacing w:after="80" w:before="120"/>
-        <w:jc w:val="center"/>
-      </w:pPr>
-      <w:r>
-        <w:rPr>
-          <w:rFonts w:ascii="Times New Roman" w:cs="Times New Roman" w:eastAsia="Times New Roman" w:hAnsi="Times New Roman"/>
-          <w:b/>
-          <w:bCs/>
-          <w:i w:val="false"/>
-          <w:iCs w:val="false"/>
-          <w:color w:val="E7E6E6"/>
-          <w:sz w:val="22"/>
-          <w:szCs w:val="22"/>
-        </w:rPr>
-        <w:t xml:space="preserve">MATHÉMATIQUES — T5</w:t>
       </w:r>
     </w:p>
     <w:p>
@@ -2210,7 +2281,20 @@
           <w:szCs w:val="24"/>
           <w:u w:val="single"/>
         </w:rPr>
-        <w:t xml:space="preserve">Dans 860 459, le chiffre 6 est dans la colonne DM : il vaut 6 × 10 000 = 60 000.</w:t>
+        <w:t xml:space="preserve">Exemple :</w:t>
+      </w:r>
+      <w:r>
+        <w:rPr>
+          <w:rFonts w:ascii="Times New Roman" w:cs="Times New Roman" w:eastAsia="Times New Roman" w:hAnsi="Times New Roman"/>
+          <w:b w:val="false"/>
+          <w:bCs w:val="false"/>
+          <w:i w:val="false"/>
+          <w:iCs w:val="false"/>
+          <w:color w:val="000000"/>
+          <w:sz w:val="24"/>
+          <w:szCs w:val="24"/>
+        </w:rPr>
+        <w:t xml:space="preserve"> Dans 860 459, le chiffre 6 est dans la colonne DM : il vaut 6 × 10 000 = 60 000.</w:t>
       </w:r>
     </w:p>
     <w:p>
@@ -2674,25 +2758,6 @@
     <w:p>
       <w:r>
         <w:br w:type="page"/>
-      </w:r>
-    </w:p>
-    <w:p>
-      <w:pPr>
-        <w:spacing w:after="80" w:before="120"/>
-        <w:jc w:val="center"/>
-      </w:pPr>
-      <w:r>
-        <w:rPr>
-          <w:rFonts w:ascii="Times New Roman" w:cs="Times New Roman" w:eastAsia="Times New Roman" w:hAnsi="Times New Roman"/>
-          <w:b/>
-          <w:bCs/>
-          <w:i w:val="false"/>
-          <w:iCs w:val="false"/>
-          <w:color w:val="E7E6E6"/>
-          <w:sz w:val="22"/>
-          <w:szCs w:val="22"/>
-        </w:rPr>
-        <w:t xml:space="preserve">MATHÉMATIQUES — T5</w:t>
       </w:r>
     </w:p>
     <w:p>
@@ -2836,7 +2901,20 @@
           <w:szCs w:val="24"/>
           <w:u w:val="single"/>
         </w:rPr>
-        <w:t xml:space="preserve">98 750 &lt; 102 300 (5 chiffres contre 6) ; 731 450 &gt; 731 405 car à la colonne des dizaines, 5 &gt; 0.</w:t>
+        <w:t xml:space="preserve">Exemple :</w:t>
+      </w:r>
+      <w:r>
+        <w:rPr>
+          <w:rFonts w:ascii="Times New Roman" w:cs="Times New Roman" w:eastAsia="Times New Roman" w:hAnsi="Times New Roman"/>
+          <w:b w:val="false"/>
+          <w:bCs w:val="false"/>
+          <w:i w:val="false"/>
+          <w:iCs w:val="false"/>
+          <w:color w:val="000000"/>
+          <w:sz w:val="24"/>
+          <w:szCs w:val="24"/>
+        </w:rPr>
+        <w:t xml:space="preserve"> 98 750 &lt; 102 300 (5 chiffres contre 6) ; 731 450 &gt; 731 405 car à la colonne des dizaines, 5 &gt; 0.</w:t>
       </w:r>
     </w:p>
     <w:p>
@@ -3300,25 +3378,6 @@
     <w:p>
       <w:r>
         <w:br w:type="page"/>
-      </w:r>
-    </w:p>
-    <w:p>
-      <w:pPr>
-        <w:spacing w:after="80" w:before="120"/>
-        <w:jc w:val="center"/>
-      </w:pPr>
-      <w:r>
-        <w:rPr>
-          <w:rFonts w:ascii="Times New Roman" w:cs="Times New Roman" w:eastAsia="Times New Roman" w:hAnsi="Times New Roman"/>
-          <w:b/>
-          <w:bCs/>
-          <w:i w:val="false"/>
-          <w:iCs w:val="false"/>
-          <w:color w:val="E7E6E6"/>
-          <w:sz w:val="22"/>
-          <w:szCs w:val="22"/>
-        </w:rPr>
-        <w:t xml:space="preserve">MATHÉMATIQUES — T5</w:t>
       </w:r>
     </w:p>
     <w:p>
@@ -3462,7 +3521,20 @@
           <w:szCs w:val="24"/>
           <w:u w:val="single"/>
         </w:rPr>
-        <w:t xml:space="preserve">350 000 = 7 × 50 000 ; ou bien 350 000 = 14 × 25 000 ; ou encore 350 000 = 35 × 10 000.</w:t>
+        <w:t xml:space="preserve">Exemple :</w:t>
+      </w:r>
+      <w:r>
+        <w:rPr>
+          <w:rFonts w:ascii="Times New Roman" w:cs="Times New Roman" w:eastAsia="Times New Roman" w:hAnsi="Times New Roman"/>
+          <w:b w:val="false"/>
+          <w:bCs w:val="false"/>
+          <w:i w:val="false"/>
+          <w:iCs w:val="false"/>
+          <w:color w:val="000000"/>
+          <w:sz w:val="24"/>
+          <w:szCs w:val="24"/>
+        </w:rPr>
+        <w:t xml:space="preserve"> 350 000 = 7 × 50 000 ; ou bien 350 000 = 14 × 25 000 ; ou encore 350 000 = 35 × 10 000.</w:t>
       </w:r>
     </w:p>
     <w:p>
@@ -3926,25 +3998,6 @@
     <w:p>
       <w:r>
         <w:br w:type="page"/>
-      </w:r>
-    </w:p>
-    <w:p>
-      <w:pPr>
-        <w:spacing w:after="80" w:before="120"/>
-        <w:jc w:val="center"/>
-      </w:pPr>
-      <w:r>
-        <w:rPr>
-          <w:rFonts w:ascii="Times New Roman" w:cs="Times New Roman" w:eastAsia="Times New Roman" w:hAnsi="Times New Roman"/>
-          <w:b/>
-          <w:bCs/>
-          <w:i w:val="false"/>
-          <w:iCs w:val="false"/>
-          <w:color w:val="E7E6E6"/>
-          <w:sz w:val="22"/>
-          <w:szCs w:val="22"/>
-        </w:rPr>
-        <w:t xml:space="preserve">MATHÉMATIQUES — T5</w:t>
       </w:r>
     </w:p>
     <w:p>
@@ -4088,7 +4141,20 @@
           <w:szCs w:val="24"/>
           <w:u w:val="single"/>
         </w:rPr>
-        <w:t xml:space="preserve">405 070 = 400 000 + 5 000 + 70 = (4 × 100 000) + (5 × 1 000) + (7 × 10).</w:t>
+        <w:t xml:space="preserve">Exemple :</w:t>
+      </w:r>
+      <w:r>
+        <w:rPr>
+          <w:rFonts w:ascii="Times New Roman" w:cs="Times New Roman" w:eastAsia="Times New Roman" w:hAnsi="Times New Roman"/>
+          <w:b w:val="false"/>
+          <w:bCs w:val="false"/>
+          <w:i w:val="false"/>
+          <w:iCs w:val="false"/>
+          <w:color w:val="000000"/>
+          <w:sz w:val="24"/>
+          <w:szCs w:val="24"/>
+        </w:rPr>
+        <w:t xml:space="preserve"> 405 070 = 400 000 + 5 000 + 70 = (4 × 100 000) + (5 × 1 000) + (7 × 10).</w:t>
       </w:r>
     </w:p>
     <w:p>
@@ -4552,25 +4618,6 @@
     <w:p>
       <w:r>
         <w:br w:type="page"/>
-      </w:r>
-    </w:p>
-    <w:p>
-      <w:pPr>
-        <w:spacing w:after="80" w:before="120"/>
-        <w:jc w:val="center"/>
-      </w:pPr>
-      <w:r>
-        <w:rPr>
-          <w:rFonts w:ascii="Times New Roman" w:cs="Times New Roman" w:eastAsia="Times New Roman" w:hAnsi="Times New Roman"/>
-          <w:b/>
-          <w:bCs/>
-          <w:i w:val="false"/>
-          <w:iCs w:val="false"/>
-          <w:color w:val="E7E6E6"/>
-          <w:sz w:val="22"/>
-          <w:szCs w:val="22"/>
-        </w:rPr>
-        <w:t xml:space="preserve">MATHÉMATIQUES — T5</w:t>
       </w:r>
     </w:p>
     <w:p>
@@ -4714,7 +4761,20 @@
           <w:szCs w:val="24"/>
           <w:u w:val="single"/>
         </w:rPr>
-        <w:t xml:space="preserve">Une tablette de chocolat de 6 carreaux dont on mange 5 : on a mangé </w:t>
+        <w:t xml:space="preserve">Exemple :</w:t>
+      </w:r>
+      <w:r>
+        <w:rPr>
+          <w:rFonts w:ascii="Times New Roman" w:cs="Times New Roman" w:eastAsia="Times New Roman" w:hAnsi="Times New Roman"/>
+          <w:b w:val="false"/>
+          <w:bCs w:val="false"/>
+          <w:i w:val="false"/>
+          <w:iCs w:val="false"/>
+          <w:color w:val="000000"/>
+          <w:sz w:val="24"/>
+          <w:szCs w:val="24"/>
+        </w:rPr>
+        <w:t xml:space="preserve"> Une tablette de chocolat de 6 carreaux dont on mange 5 : on a mangé </w:t>
       </w:r>
       <m:oMath>
         <m:f>
@@ -4735,12 +4795,11 @@
           <w:rFonts w:ascii="Times New Roman" w:cs="Times New Roman" w:eastAsia="Times New Roman" w:hAnsi="Times New Roman"/>
           <w:b w:val="false"/>
           <w:bCs w:val="false"/>
-          <w:i/>
-          <w:iCs/>
-          <w:color w:val="000000"/>
-          <w:sz w:val="24"/>
-          <w:szCs w:val="24"/>
-          <w:u w:val="single"/>
+          <w:i w:val="false"/>
+          <w:iCs w:val="false"/>
+          <w:color w:val="000000"/>
+          <w:sz w:val="24"/>
+          <w:szCs w:val="24"/>
         </w:rPr>
         <w:t xml:space="preserve">, « cinq sixièmes », et il reste </w:t>
       </w:r>
@@ -4763,12 +4822,11 @@
           <w:rFonts w:ascii="Times New Roman" w:cs="Times New Roman" w:eastAsia="Times New Roman" w:hAnsi="Times New Roman"/>
           <w:b w:val="false"/>
           <w:bCs w:val="false"/>
-          <w:i/>
-          <w:iCs/>
-          <w:color w:val="000000"/>
-          <w:sz w:val="24"/>
-          <w:szCs w:val="24"/>
-          <w:u w:val="single"/>
+          <w:i w:val="false"/>
+          <w:iCs w:val="false"/>
+          <w:color w:val="000000"/>
+          <w:sz w:val="24"/>
+          <w:szCs w:val="24"/>
         </w:rPr>
         <w:t xml:space="preserve">.</w:t>
       </w:r>
@@ -6071,25 +6129,6 @@
     <w:p>
       <w:r>
         <w:br w:type="page"/>
-      </w:r>
-    </w:p>
-    <w:p>
-      <w:pPr>
-        <w:spacing w:after="80" w:before="120"/>
-        <w:jc w:val="center"/>
-      </w:pPr>
-      <w:r>
-        <w:rPr>
-          <w:rFonts w:ascii="Times New Roman" w:cs="Times New Roman" w:eastAsia="Times New Roman" w:hAnsi="Times New Roman"/>
-          <w:b/>
-          <w:bCs/>
-          <w:i w:val="false"/>
-          <w:iCs w:val="false"/>
-          <w:color w:val="E7E6E6"/>
-          <w:sz w:val="22"/>
-          <w:szCs w:val="22"/>
-        </w:rPr>
-        <w:t xml:space="preserve">MATHÉMATIQUES — T5</w:t>
       </w:r>
     </w:p>
     <w:p>
@@ -6302,20 +6341,6 @@
         <w:spacing w:after="130" w:before="100" w:line="300"/>
         <w:jc w:val="both"/>
       </w:pPr>
-      <m:oMath>
-        <m:f>
-          <m:num>
-            <m:r>
-              <m:t>3</m:t>
-            </m:r>
-          </m:num>
-          <m:den>
-            <m:r>
-              <m:t>5</m:t>
-            </m:r>
-          </m:den>
-        </m:f>
-      </m:oMath>
       <w:r>
         <w:rPr>
           <w:rFonts w:ascii="Times New Roman" w:cs="Times New Roman" w:eastAsia="Times New Roman" w:hAnsi="Times New Roman"/>
@@ -6328,6 +6353,46 @@
           <w:szCs w:val="24"/>
           <w:u w:val="single"/>
         </w:rPr>
+        <w:t xml:space="preserve">Exemple :</w:t>
+      </w:r>
+      <w:r>
+        <w:rPr>
+          <w:rFonts w:ascii="Times New Roman" w:cs="Times New Roman" w:eastAsia="Times New Roman" w:hAnsi="Times New Roman"/>
+          <w:b w:val="false"/>
+          <w:bCs w:val="false"/>
+          <w:i w:val="false"/>
+          <w:iCs w:val="false"/>
+          <w:color w:val="000000"/>
+          <w:sz w:val="24"/>
+          <w:szCs w:val="24"/>
+        </w:rPr>
+        <w:t xml:space="preserve"> </w:t>
+      </w:r>
+      <m:oMath>
+        <m:f>
+          <m:num>
+            <m:r>
+              <m:t>3</m:t>
+            </m:r>
+          </m:num>
+          <m:den>
+            <m:r>
+              <m:t>5</m:t>
+            </m:r>
+          </m:den>
+        </m:f>
+      </m:oMath>
+      <w:r>
+        <w:rPr>
+          <w:rFonts w:ascii="Times New Roman" w:cs="Times New Roman" w:eastAsia="Times New Roman" w:hAnsi="Times New Roman"/>
+          <w:b w:val="false"/>
+          <w:bCs w:val="false"/>
+          <w:i w:val="false"/>
+          <w:iCs w:val="false"/>
+          <w:color w:val="000000"/>
+          <w:sz w:val="24"/>
+          <w:szCs w:val="24"/>
+        </w:rPr>
         <w:t xml:space="preserve">= </w:t>
       </w:r>
       <m:oMath>
@@ -6349,12 +6414,11 @@
           <w:rFonts w:ascii="Times New Roman" w:cs="Times New Roman" w:eastAsia="Times New Roman" w:hAnsi="Times New Roman"/>
           <w:b w:val="false"/>
           <w:bCs w:val="false"/>
-          <w:i/>
-          <w:iCs/>
-          <w:color w:val="000000"/>
-          <w:sz w:val="24"/>
-          <w:szCs w:val="24"/>
-          <w:u w:val="single"/>
+          <w:i w:val="false"/>
+          <w:iCs w:val="false"/>
+          <w:color w:val="000000"/>
+          <w:sz w:val="24"/>
+          <w:szCs w:val="24"/>
         </w:rPr>
         <w:t xml:space="preserve">= </w:t>
       </w:r>
@@ -6377,12 +6441,11 @@
           <w:rFonts w:ascii="Times New Roman" w:cs="Times New Roman" w:eastAsia="Times New Roman" w:hAnsi="Times New Roman"/>
           <w:b w:val="false"/>
           <w:bCs w:val="false"/>
-          <w:i/>
-          <w:iCs/>
-          <w:color w:val="000000"/>
-          <w:sz w:val="24"/>
-          <w:szCs w:val="24"/>
-          <w:u w:val="single"/>
+          <w:i w:val="false"/>
+          <w:iCs w:val="false"/>
+          <w:color w:val="000000"/>
+          <w:sz w:val="24"/>
+          <w:szCs w:val="24"/>
         </w:rPr>
         <w:t xml:space="preserve">: on a multiplié haut et bas par 2, puis par 10.</w:t>
       </w:r>
@@ -8495,25 +8558,6 @@
     <w:p>
       <w:r>
         <w:br w:type="page"/>
-      </w:r>
-    </w:p>
-    <w:p>
-      <w:pPr>
-        <w:spacing w:after="80" w:before="120"/>
-        <w:jc w:val="center"/>
-      </w:pPr>
-      <w:r>
-        <w:rPr>
-          <w:rFonts w:ascii="Times New Roman" w:cs="Times New Roman" w:eastAsia="Times New Roman" w:hAnsi="Times New Roman"/>
-          <w:b/>
-          <w:bCs/>
-          <w:i w:val="false"/>
-          <w:iCs w:val="false"/>
-          <w:color w:val="E7E6E6"/>
-          <w:sz w:val="22"/>
-          <w:szCs w:val="22"/>
-        </w:rPr>
-        <w:t xml:space="preserve">MATHÉMATIQUES — T5</w:t>
       </w:r>
     </w:p>
     <w:p>
@@ -8645,20 +8689,6 @@
         <w:spacing w:after="130" w:before="100" w:line="300"/>
         <w:jc w:val="both"/>
       </w:pPr>
-      <m:oMath>
-        <m:f>
-          <m:num>
-            <m:r>
-              <m:t>2</m:t>
-            </m:r>
-          </m:num>
-          <m:den>
-            <m:r>
-              <m:t>3</m:t>
-            </m:r>
-          </m:den>
-        </m:f>
-      </m:oMath>
       <w:r>
         <w:rPr>
           <w:rFonts w:ascii="Times New Roman" w:cs="Times New Roman" w:eastAsia="Times New Roman" w:hAnsi="Times New Roman"/>
@@ -8671,6 +8701,46 @@
           <w:szCs w:val="24"/>
           <w:u w:val="single"/>
         </w:rPr>
+        <w:t xml:space="preserve">Exemple :</w:t>
+      </w:r>
+      <w:r>
+        <w:rPr>
+          <w:rFonts w:ascii="Times New Roman" w:cs="Times New Roman" w:eastAsia="Times New Roman" w:hAnsi="Times New Roman"/>
+          <w:b w:val="false"/>
+          <w:bCs w:val="false"/>
+          <w:i w:val="false"/>
+          <w:iCs w:val="false"/>
+          <w:color w:val="000000"/>
+          <w:sz w:val="24"/>
+          <w:szCs w:val="24"/>
+        </w:rPr>
+        <w:t xml:space="preserve"> </w:t>
+      </w:r>
+      <m:oMath>
+        <m:f>
+          <m:num>
+            <m:r>
+              <m:t>2</m:t>
+            </m:r>
+          </m:num>
+          <m:den>
+            <m:r>
+              <m:t>3</m:t>
+            </m:r>
+          </m:den>
+        </m:f>
+      </m:oMath>
+      <w:r>
+        <w:rPr>
+          <w:rFonts w:ascii="Times New Roman" w:cs="Times New Roman" w:eastAsia="Times New Roman" w:hAnsi="Times New Roman"/>
+          <w:b w:val="false"/>
+          <w:bCs w:val="false"/>
+          <w:i w:val="false"/>
+          <w:iCs w:val="false"/>
+          <w:color w:val="000000"/>
+          <w:sz w:val="24"/>
+          <w:szCs w:val="24"/>
+        </w:rPr>
         <w:t xml:space="preserve">et </w:t>
       </w:r>
       <m:oMath>
@@ -8692,12 +8762,11 @@
           <w:rFonts w:ascii="Times New Roman" w:cs="Times New Roman" w:eastAsia="Times New Roman" w:hAnsi="Times New Roman"/>
           <w:b w:val="false"/>
           <w:bCs w:val="false"/>
-          <w:i/>
-          <w:iCs/>
-          <w:color w:val="000000"/>
-          <w:sz w:val="24"/>
-          <w:szCs w:val="24"/>
-          <w:u w:val="single"/>
+          <w:i w:val="false"/>
+          <w:iCs w:val="false"/>
+          <w:color w:val="000000"/>
+          <w:sz w:val="24"/>
+          <w:szCs w:val="24"/>
         </w:rPr>
         <w:t xml:space="preserve">: équivalentes </w:t>
       </w:r>
@@ -8720,12 +8789,11 @@
           <w:rFonts w:ascii="Times New Roman" w:cs="Times New Roman" w:eastAsia="Times New Roman" w:hAnsi="Times New Roman"/>
           <w:b w:val="false"/>
           <w:bCs w:val="false"/>
-          <w:i/>
-          <w:iCs/>
-          <w:color w:val="000000"/>
-          <w:sz w:val="24"/>
-          <w:szCs w:val="24"/>
-          <w:u w:val="single"/>
+          <w:i w:val="false"/>
+          <w:iCs w:val="false"/>
+          <w:color w:val="000000"/>
+          <w:sz w:val="24"/>
+          <w:szCs w:val="24"/>
         </w:rPr>
         <w:t xml:space="preserve">et </w:t>
       </w:r>
@@ -8748,12 +8816,11 @@
           <w:rFonts w:ascii="Times New Roman" w:cs="Times New Roman" w:eastAsia="Times New Roman" w:hAnsi="Times New Roman"/>
           <w:b w:val="false"/>
           <w:bCs w:val="false"/>
-          <w:i/>
-          <w:iCs/>
-          <w:color w:val="000000"/>
-          <w:sz w:val="24"/>
-          <w:szCs w:val="24"/>
-          <w:u w:val="single"/>
+          <w:i w:val="false"/>
+          <w:iCs w:val="false"/>
+          <w:color w:val="000000"/>
+          <w:sz w:val="24"/>
+          <w:szCs w:val="24"/>
         </w:rPr>
         <w:t xml:space="preserve">; </w:t>
       </w:r>
@@ -8776,12 +8843,11 @@
           <w:rFonts w:ascii="Times New Roman" w:cs="Times New Roman" w:eastAsia="Times New Roman" w:hAnsi="Times New Roman"/>
           <w:b w:val="false"/>
           <w:bCs w:val="false"/>
-          <w:i/>
-          <w:iCs/>
-          <w:color w:val="000000"/>
-          <w:sz w:val="24"/>
-          <w:szCs w:val="24"/>
-          <w:u w:val="single"/>
+          <w:i w:val="false"/>
+          <w:iCs w:val="false"/>
+          <w:color w:val="000000"/>
+          <w:sz w:val="24"/>
+          <w:szCs w:val="24"/>
         </w:rPr>
         <w:t xml:space="preserve">est plus à droite, donc </w:t>
       </w:r>
@@ -8804,12 +8870,11 @@
           <w:rFonts w:ascii="Times New Roman" w:cs="Times New Roman" w:eastAsia="Times New Roman" w:hAnsi="Times New Roman"/>
           <w:b w:val="false"/>
           <w:bCs w:val="false"/>
-          <w:i/>
-          <w:iCs/>
-          <w:color w:val="000000"/>
-          <w:sz w:val="24"/>
-          <w:szCs w:val="24"/>
-          <w:u w:val="single"/>
+          <w:i w:val="false"/>
+          <w:iCs w:val="false"/>
+          <w:color w:val="000000"/>
+          <w:sz w:val="24"/>
+          <w:szCs w:val="24"/>
         </w:rPr>
         <w:t xml:space="preserve">&gt; </w:t>
       </w:r>
@@ -8832,12 +8897,11 @@
           <w:rFonts w:ascii="Times New Roman" w:cs="Times New Roman" w:eastAsia="Times New Roman" w:hAnsi="Times New Roman"/>
           <w:b w:val="false"/>
           <w:bCs w:val="false"/>
-          <w:i/>
-          <w:iCs/>
-          <w:color w:val="000000"/>
-          <w:sz w:val="24"/>
-          <w:szCs w:val="24"/>
-          <w:u w:val="single"/>
+          <w:i w:val="false"/>
+          <w:iCs w:val="false"/>
+          <w:color w:val="000000"/>
+          <w:sz w:val="24"/>
+          <w:szCs w:val="24"/>
         </w:rPr>
         <w:t xml:space="preserve">.</w:t>
       </w:r>
@@ -11571,25 +11635,6 @@
     <w:p>
       <w:r>
         <w:br w:type="page"/>
-      </w:r>
-    </w:p>
-    <w:p>
-      <w:pPr>
-        <w:spacing w:after="80" w:before="120"/>
-        <w:jc w:val="center"/>
-      </w:pPr>
-      <w:r>
-        <w:rPr>
-          <w:rFonts w:ascii="Times New Roman" w:cs="Times New Roman" w:eastAsia="Times New Roman" w:hAnsi="Times New Roman"/>
-          <w:b/>
-          <w:bCs/>
-          <w:i w:val="false"/>
-          <w:iCs w:val="false"/>
-          <w:color w:val="E7E6E6"/>
-          <w:sz w:val="22"/>
-          <w:szCs w:val="22"/>
-        </w:rPr>
-        <w:t xml:space="preserve">MATHÉMATIQUES — T5</w:t>
       </w:r>
     </w:p>
     <w:p>
@@ -11775,20 +11820,6 @@
         <w:spacing w:after="130" w:before="100" w:line="300"/>
         <w:jc w:val="both"/>
       </w:pPr>
-      <m:oMath>
-        <m:f>
-          <m:num>
-            <m:r>
-              <m:t>11</m:t>
-            </m:r>
-          </m:num>
-          <m:den>
-            <m:r>
-              <m:t>8</m:t>
-            </m:r>
-          </m:den>
-        </m:f>
-      </m:oMath>
       <w:r>
         <w:rPr>
           <w:rFonts w:ascii="Times New Roman" w:cs="Times New Roman" w:eastAsia="Times New Roman" w:hAnsi="Times New Roman"/>
@@ -11801,6 +11832,46 @@
           <w:szCs w:val="24"/>
           <w:u w:val="single"/>
         </w:rPr>
+        <w:t xml:space="preserve">Exemple :</w:t>
+      </w:r>
+      <w:r>
+        <w:rPr>
+          <w:rFonts w:ascii="Times New Roman" w:cs="Times New Roman" w:eastAsia="Times New Roman" w:hAnsi="Times New Roman"/>
+          <w:b w:val="false"/>
+          <w:bCs w:val="false"/>
+          <w:i w:val="false"/>
+          <w:iCs w:val="false"/>
+          <w:color w:val="000000"/>
+          <w:sz w:val="24"/>
+          <w:szCs w:val="24"/>
+        </w:rPr>
+        <w:t xml:space="preserve"> </w:t>
+      </w:r>
+      <m:oMath>
+        <m:f>
+          <m:num>
+            <m:r>
+              <m:t>11</m:t>
+            </m:r>
+          </m:num>
+          <m:den>
+            <m:r>
+              <m:t>8</m:t>
+            </m:r>
+          </m:den>
+        </m:f>
+      </m:oMath>
+      <w:r>
+        <w:rPr>
+          <w:rFonts w:ascii="Times New Roman" w:cs="Times New Roman" w:eastAsia="Times New Roman" w:hAnsi="Times New Roman"/>
+          <w:b w:val="false"/>
+          <w:bCs w:val="false"/>
+          <w:i w:val="false"/>
+          <w:iCs w:val="false"/>
+          <w:color w:val="000000"/>
+          <w:sz w:val="24"/>
+          <w:szCs w:val="24"/>
+        </w:rPr>
         <w:t xml:space="preserve">= 1 + </w:t>
       </w:r>
       <m:oMath>
@@ -11822,12 +11893,11 @@
           <w:rFonts w:ascii="Times New Roman" w:cs="Times New Roman" w:eastAsia="Times New Roman" w:hAnsi="Times New Roman"/>
           <w:b w:val="false"/>
           <w:bCs w:val="false"/>
-          <w:i/>
-          <w:iCs/>
-          <w:color w:val="000000"/>
-          <w:sz w:val="24"/>
-          <w:szCs w:val="24"/>
-          <w:u w:val="single"/>
+          <w:i w:val="false"/>
+          <w:iCs w:val="false"/>
+          <w:color w:val="000000"/>
+          <w:sz w:val="24"/>
+          <w:szCs w:val="24"/>
         </w:rPr>
         <w:t xml:space="preserve">(« un et trois huitièmes ») ; à l’inverse, 1 + </w:t>
       </w:r>
@@ -11850,12 +11920,11 @@
           <w:rFonts w:ascii="Times New Roman" w:cs="Times New Roman" w:eastAsia="Times New Roman" w:hAnsi="Times New Roman"/>
           <w:b w:val="false"/>
           <w:bCs w:val="false"/>
-          <w:i/>
-          <w:iCs/>
-          <w:color w:val="000000"/>
-          <w:sz w:val="24"/>
-          <w:szCs w:val="24"/>
-          <w:u w:val="single"/>
+          <w:i w:val="false"/>
+          <w:iCs w:val="false"/>
+          <w:color w:val="000000"/>
+          <w:sz w:val="24"/>
+          <w:szCs w:val="24"/>
         </w:rPr>
         <w:t xml:space="preserve">= </w:t>
       </w:r>
@@ -11878,12 +11947,11 @@
           <w:rFonts w:ascii="Times New Roman" w:cs="Times New Roman" w:eastAsia="Times New Roman" w:hAnsi="Times New Roman"/>
           <w:b w:val="false"/>
           <w:bCs w:val="false"/>
-          <w:i/>
-          <w:iCs/>
-          <w:color w:val="000000"/>
-          <w:sz w:val="24"/>
-          <w:szCs w:val="24"/>
-          <w:u w:val="single"/>
+          <w:i w:val="false"/>
+          <w:iCs w:val="false"/>
+          <w:color w:val="000000"/>
+          <w:sz w:val="24"/>
+          <w:szCs w:val="24"/>
         </w:rPr>
         <w:t xml:space="preserve">+ </w:t>
       </w:r>
@@ -11906,12 +11974,11 @@
           <w:rFonts w:ascii="Times New Roman" w:cs="Times New Roman" w:eastAsia="Times New Roman" w:hAnsi="Times New Roman"/>
           <w:b w:val="false"/>
           <w:bCs w:val="false"/>
-          <w:i/>
-          <w:iCs/>
-          <w:color w:val="000000"/>
-          <w:sz w:val="24"/>
-          <w:szCs w:val="24"/>
-          <w:u w:val="single"/>
+          <w:i w:val="false"/>
+          <w:iCs w:val="false"/>
+          <w:color w:val="000000"/>
+          <w:sz w:val="24"/>
+          <w:szCs w:val="24"/>
         </w:rPr>
         <w:t xml:space="preserve">= </w:t>
       </w:r>
@@ -11934,12 +12001,11 @@
           <w:rFonts w:ascii="Times New Roman" w:cs="Times New Roman" w:eastAsia="Times New Roman" w:hAnsi="Times New Roman"/>
           <w:b w:val="false"/>
           <w:bCs w:val="false"/>
-          <w:i/>
-          <w:iCs/>
-          <w:color w:val="000000"/>
-          <w:sz w:val="24"/>
-          <w:szCs w:val="24"/>
-          <w:u w:val="single"/>
+          <w:i w:val="false"/>
+          <w:iCs w:val="false"/>
+          <w:color w:val="000000"/>
+          <w:sz w:val="24"/>
+          <w:szCs w:val="24"/>
         </w:rPr>
         <w:t xml:space="preserve">.</w:t>
       </w:r>
@@ -13701,25 +13767,6 @@
     <w:p>
       <w:r>
         <w:br w:type="page"/>
-      </w:r>
-    </w:p>
-    <w:p>
-      <w:pPr>
-        <w:spacing w:after="80" w:before="120"/>
-        <w:jc w:val="center"/>
-      </w:pPr>
-      <w:r>
-        <w:rPr>
-          <w:rFonts w:ascii="Times New Roman" w:cs="Times New Roman" w:eastAsia="Times New Roman" w:hAnsi="Times New Roman"/>
-          <w:b/>
-          <w:bCs/>
-          <w:i w:val="false"/>
-          <w:iCs w:val="false"/>
-          <w:color w:val="E7E6E6"/>
-          <w:sz w:val="22"/>
-          <w:szCs w:val="22"/>
-        </w:rPr>
-        <w:t xml:space="preserve">MATHÉMATIQUES — T5</w:t>
       </w:r>
     </w:p>
     <w:p>
@@ -13863,7 +13910,20 @@
           <w:szCs w:val="24"/>
           <w:u w:val="single"/>
         </w:rPr>
-        <w:t xml:space="preserve">0,07 = 7 centièmes : sur la grille, 7 petites cases seulement ; 0,7 = 7 dixièmes : 7 colonnes entières !</w:t>
+        <w:t xml:space="preserve">Exemple :</w:t>
+      </w:r>
+      <w:r>
+        <w:rPr>
+          <w:rFonts w:ascii="Times New Roman" w:cs="Times New Roman" w:eastAsia="Times New Roman" w:hAnsi="Times New Roman"/>
+          <w:b w:val="false"/>
+          <w:bCs w:val="false"/>
+          <w:i w:val="false"/>
+          <w:iCs w:val="false"/>
+          <w:color w:val="000000"/>
+          <w:sz w:val="24"/>
+          <w:szCs w:val="24"/>
+        </w:rPr>
+        <w:t xml:space="preserve"> 0,07 = 7 centièmes : sur la grille, 7 petites cases seulement ; 0,7 = 7 dixièmes : 7 colonnes entières !</w:t>
       </w:r>
     </w:p>
     <w:p>
@@ -14327,25 +14387,6 @@
     <w:p>
       <w:r>
         <w:br w:type="page"/>
-      </w:r>
-    </w:p>
-    <w:p>
-      <w:pPr>
-        <w:spacing w:after="80" w:before="120"/>
-        <w:jc w:val="center"/>
-      </w:pPr>
-      <w:r>
-        <w:rPr>
-          <w:rFonts w:ascii="Times New Roman" w:cs="Times New Roman" w:eastAsia="Times New Roman" w:hAnsi="Times New Roman"/>
-          <w:b/>
-          <w:bCs/>
-          <w:i w:val="false"/>
-          <w:iCs w:val="false"/>
-          <w:color w:val="E7E6E6"/>
-          <w:sz w:val="22"/>
-          <w:szCs w:val="22"/>
-        </w:rPr>
-        <w:t xml:space="preserve">MATHÉMATIQUES — T5</w:t>
       </w:r>
     </w:p>
     <w:p>
@@ -14489,7 +14530,20 @@
           <w:szCs w:val="24"/>
           <w:u w:val="single"/>
         </w:rPr>
-        <w:t xml:space="preserve">7,3 et 7,28 : 7,3 = 7,30 et 30 centièmes &gt; 28 centièmes, donc 7,3 &gt; 7,28.</w:t>
+        <w:t xml:space="preserve">Exemple :</w:t>
+      </w:r>
+      <w:r>
+        <w:rPr>
+          <w:rFonts w:ascii="Times New Roman" w:cs="Times New Roman" w:eastAsia="Times New Roman" w:hAnsi="Times New Roman"/>
+          <w:b w:val="false"/>
+          <w:bCs w:val="false"/>
+          <w:i w:val="false"/>
+          <w:iCs w:val="false"/>
+          <w:color w:val="000000"/>
+          <w:sz w:val="24"/>
+          <w:szCs w:val="24"/>
+        </w:rPr>
+        <w:t xml:space="preserve"> 7,3 et 7,28 : 7,3 = 7,30 et 30 centièmes &gt; 28 centièmes, donc 7,3 &gt; 7,28.</w:t>
       </w:r>
     </w:p>
     <w:p>
@@ -14953,25 +15007,6 @@
     <w:p>
       <w:r>
         <w:br w:type="page"/>
-      </w:r>
-    </w:p>
-    <w:p>
-      <w:pPr>
-        <w:spacing w:after="80" w:before="120"/>
-        <w:jc w:val="center"/>
-      </w:pPr>
-      <w:r>
-        <w:rPr>
-          <w:rFonts w:ascii="Times New Roman" w:cs="Times New Roman" w:eastAsia="Times New Roman" w:hAnsi="Times New Roman"/>
-          <w:b/>
-          <w:bCs/>
-          <w:i w:val="false"/>
-          <w:iCs w:val="false"/>
-          <w:color w:val="E7E6E6"/>
-          <w:sz w:val="22"/>
-          <w:szCs w:val="22"/>
-        </w:rPr>
-        <w:t xml:space="preserve">MATHÉMATIQUES — T5</w:t>
       </w:r>
     </w:p>
     <w:p>
@@ -15184,20 +15219,6 @@
         <w:spacing w:after="130" w:before="100" w:line="300"/>
         <w:jc w:val="both"/>
       </w:pPr>
-      <m:oMath>
-        <m:f>
-          <m:num>
-            <m:r>
-              <m:t>7</m:t>
-            </m:r>
-          </m:num>
-          <m:den>
-            <m:r>
-              <m:t>10</m:t>
-            </m:r>
-          </m:den>
-        </m:f>
-      </m:oMath>
       <w:r>
         <w:rPr>
           <w:rFonts w:ascii="Times New Roman" w:cs="Times New Roman" w:eastAsia="Times New Roman" w:hAnsi="Times New Roman"/>
@@ -15210,6 +15231,46 @@
           <w:szCs w:val="24"/>
           <w:u w:val="single"/>
         </w:rPr>
+        <w:t xml:space="preserve">Exemple :</w:t>
+      </w:r>
+      <w:r>
+        <w:rPr>
+          <w:rFonts w:ascii="Times New Roman" w:cs="Times New Roman" w:eastAsia="Times New Roman" w:hAnsi="Times New Roman"/>
+          <w:b w:val="false"/>
+          <w:bCs w:val="false"/>
+          <w:i w:val="false"/>
+          <w:iCs w:val="false"/>
+          <w:color w:val="000000"/>
+          <w:sz w:val="24"/>
+          <w:szCs w:val="24"/>
+        </w:rPr>
+        <w:t xml:space="preserve"> </w:t>
+      </w:r>
+      <m:oMath>
+        <m:f>
+          <m:num>
+            <m:r>
+              <m:t>7</m:t>
+            </m:r>
+          </m:num>
+          <m:den>
+            <m:r>
+              <m:t>10</m:t>
+            </m:r>
+          </m:den>
+        </m:f>
+      </m:oMath>
+      <w:r>
+        <w:rPr>
+          <w:rFonts w:ascii="Times New Roman" w:cs="Times New Roman" w:eastAsia="Times New Roman" w:hAnsi="Times New Roman"/>
+          <w:b w:val="false"/>
+          <w:bCs w:val="false"/>
+          <w:i w:val="false"/>
+          <w:iCs w:val="false"/>
+          <w:color w:val="000000"/>
+          <w:sz w:val="24"/>
+          <w:szCs w:val="24"/>
+        </w:rPr>
         <w:t xml:space="preserve">= 0,7 ; </w:t>
       </w:r>
       <m:oMath>
@@ -15231,12 +15292,11 @@
           <w:rFonts w:ascii="Times New Roman" w:cs="Times New Roman" w:eastAsia="Times New Roman" w:hAnsi="Times New Roman"/>
           <w:b w:val="false"/>
           <w:bCs w:val="false"/>
-          <w:i/>
-          <w:iCs/>
-          <w:color w:val="000000"/>
-          <w:sz w:val="24"/>
-          <w:szCs w:val="24"/>
-          <w:u w:val="single"/>
+          <w:i w:val="false"/>
+          <w:iCs w:val="false"/>
+          <w:color w:val="000000"/>
+          <w:sz w:val="24"/>
+          <w:szCs w:val="24"/>
         </w:rPr>
         <w:t xml:space="preserve">= 1,30 = 1,3 ; dans l’autre sens, 0,85 = </w:t>
       </w:r>
@@ -15259,12 +15319,11 @@
           <w:rFonts w:ascii="Times New Roman" w:cs="Times New Roman" w:eastAsia="Times New Roman" w:hAnsi="Times New Roman"/>
           <w:b w:val="false"/>
           <w:bCs w:val="false"/>
-          <w:i/>
-          <w:iCs/>
-          <w:color w:val="000000"/>
-          <w:sz w:val="24"/>
-          <w:szCs w:val="24"/>
-          <w:u w:val="single"/>
+          <w:i w:val="false"/>
+          <w:iCs w:val="false"/>
+          <w:color w:val="000000"/>
+          <w:sz w:val="24"/>
+          <w:szCs w:val="24"/>
         </w:rPr>
         <w:t xml:space="preserve">.</w:t>
       </w:r>

</xml_diff>